<commit_message>
Added reveal-hugo support scripts
</commit_message>
<xml_diff>
--- a/createreport/docs/001はしがき.docx
+++ b/createreport/docs/001はしがき.docx
@@ -1,6 +1,6 @@
 
 <file path=word/document.xml><?xml version="1.0" encoding="utf-8"?>
-<w:document xmlns:wpc="http://schemas.microsoft.com/office/word/2010/wordprocessingCanvas" xmlns:cx="http://schemas.microsoft.com/office/drawing/2014/chartex" xmlns:cx1="http://schemas.microsoft.com/office/drawing/2015/9/8/chartex" xmlns:cx2="http://schemas.microsoft.com/office/drawing/2015/10/21/chartex" xmlns:cx3="http://schemas.microsoft.com/office/drawing/2016/5/9/chartex" xmlns:cx4="http://schemas.microsoft.com/office/drawing/2016/5/10/chartex" xmlns:cx5="http://schemas.microsoft.com/office/drawing/2016/5/11/chartex" xmlns:cx6="http://schemas.microsoft.com/office/drawing/2016/5/12/chartex" xmlns:cx7="http://schemas.microsoft.com/office/drawing/2016/5/13/chartex" xmlns:cx8="http://schemas.microsoft.com/office/drawing/2016/5/14/chartex" xmlns:mc="http://schemas.openxmlformats.org/markup-compatibility/2006" xmlns:aink="http://schemas.microsoft.com/office/drawing/2016/ink" xmlns:am3d="http://schemas.microsoft.com/office/drawing/2017/model3d" xmlns:o="urn:schemas-microsoft-com:office:office" xmlns:oel="http://schemas.microsoft.com/office/2019/extlst" xmlns:r="http://schemas.openxmlformats.org/officeDocument/2006/relationships" xmlns:m="http://schemas.openxmlformats.org/officeDocument/2006/math" xmlns:v="urn:schemas-microsoft-com:vml" xmlns:wp14="http://schemas.microsoft.com/office/word/2010/wordprocessingDrawing" xmlns:wp="http://schemas.openxmlformats.org/drawingml/2006/wordprocessingDrawing" xmlns:w10="urn:schemas-microsoft-com:office:word" xmlns:w="http://schemas.openxmlformats.org/wordprocessingml/2006/main" xmlns:w14="http://schemas.microsoft.com/office/word/2010/wordml" xmlns:w15="http://schemas.microsoft.com/office/word/2012/wordml" xmlns:w16cex="http://schemas.microsoft.com/office/word/2018/wordml/cex" xmlns:w16cid="http://schemas.microsoft.com/office/word/2016/wordml/cid" xmlns:w16="http://schemas.microsoft.com/office/word/2018/wordml" xmlns:w16du="http://schemas.microsoft.com/office/word/2023/wordml/word16du" xmlns:w16sdtdh="http://schemas.microsoft.com/office/word/2020/wordml/sdtdatahash" xmlns:w16se="http://schemas.microsoft.com/office/word/2015/wordml/symex" xmlns:wpg="http://schemas.microsoft.com/office/word/2010/wordprocessingGroup" xmlns:wpi="http://schemas.microsoft.com/office/word/2010/wordprocessingInk" xmlns:wne="http://schemas.microsoft.com/office/word/2006/wordml" xmlns:wps="http://schemas.microsoft.com/office/word/2010/wordprocessingShape" mc:Ignorable="w14 w15 w16se w16cid w16 w16cex w16sdtdh w16du wp14">
+<w:document xmlns:wpc="http://schemas.microsoft.com/office/word/2010/wordprocessingCanvas" xmlns:cx="http://schemas.microsoft.com/office/drawing/2014/chartex" xmlns:cx1="http://schemas.microsoft.com/office/drawing/2015/9/8/chartex" xmlns:cx2="http://schemas.microsoft.com/office/drawing/2015/10/21/chartex" xmlns:cx3="http://schemas.microsoft.com/office/drawing/2016/5/9/chartex" xmlns:cx4="http://schemas.microsoft.com/office/drawing/2016/5/10/chartex" xmlns:cx5="http://schemas.microsoft.com/office/drawing/2016/5/11/chartex" xmlns:cx6="http://schemas.microsoft.com/office/drawing/2016/5/12/chartex" xmlns:cx7="http://schemas.microsoft.com/office/drawing/2016/5/13/chartex" xmlns:cx8="http://schemas.microsoft.com/office/drawing/2016/5/14/chartex" xmlns:mc="http://schemas.openxmlformats.org/markup-compatibility/2006" xmlns:aink="http://schemas.microsoft.com/office/drawing/2016/ink" xmlns:am3d="http://schemas.microsoft.com/office/drawing/2017/model3d" xmlns:o="urn:schemas-microsoft-com:office:office" xmlns:oel="http://schemas.microsoft.com/office/2019/extlst" xmlns:r="http://schemas.openxmlformats.org/officeDocument/2006/relationships" xmlns:m="http://schemas.openxmlformats.org/officeDocument/2006/math" xmlns:v="urn:schemas-microsoft-com:vml" xmlns:wp14="http://schemas.microsoft.com/office/word/2010/wordprocessingDrawing" xmlns:wp="http://schemas.openxmlformats.org/drawingml/2006/wordprocessingDrawing" xmlns:w10="urn:schemas-microsoft-com:office:word" xmlns:w="http://schemas.openxmlformats.org/wordprocessingml/2006/main" xmlns:w14="http://schemas.microsoft.com/office/word/2010/wordml" xmlns:w15="http://schemas.microsoft.com/office/word/2012/wordml" xmlns:w16cex="http://schemas.microsoft.com/office/word/2018/wordml/cex" xmlns:w16cid="http://schemas.microsoft.com/office/word/2016/wordml/cid" xmlns:w16="http://schemas.microsoft.com/office/word/2018/wordml" xmlns:w16du="http://schemas.microsoft.com/office/word/2023/wordml/word16du" xmlns:w16sdtdh="http://schemas.microsoft.com/office/word/2020/wordml/sdtdatahash" xmlns:w16sdtfl="http://schemas.microsoft.com/office/word/2024/wordml/sdtformatlock" xmlns:w16se="http://schemas.microsoft.com/office/word/2015/wordml/symex" xmlns:wpg="http://schemas.microsoft.com/office/word/2010/wordprocessingGroup" xmlns:wpi="http://schemas.microsoft.com/office/word/2010/wordprocessingInk" xmlns:wne="http://schemas.microsoft.com/office/word/2006/wordml" xmlns:wps="http://schemas.microsoft.com/office/word/2010/wordprocessingShape" mc:Ignorable="w14 w15 w16se w16cid w16 w16cex w16sdtdh w16sdtfl w16du wp14">
   <w:body>
     <w:p>
       <w:pPr>
@@ -9,92 +9,985 @@
         <w:spacing w:line="240" w:lineRule="atLeast"/>
         <w:rPr>
           <w:rFonts w:asciiTheme="minorEastAsia" w:hAnsiTheme="minorEastAsia"/>
-          <w:sz w:val="24"/>
-        </w:rPr>
-      </w:pPr>
+          <w:b/>
+          <w:bCs/>
+          <w:sz w:val="24"/>
+        </w:rPr>
+      </w:pPr>
+      <w:r>
+        <w:rPr>
+          <w:rFonts w:asciiTheme="minorEastAsia" w:hAnsiTheme="minorEastAsia"/>
+          <w:b/>
+          <w:bCs/>
+          <w:sz w:val="24"/>
+        </w:rPr>
+        <w:t>はしがき（</w:t>
+      </w:r>
       <w:r>
         <w:rPr>
           <w:rFonts w:asciiTheme="minorEastAsia" w:hAnsiTheme="minorEastAsia" w:hint="eastAsia"/>
-          <w:sz w:val="24"/>
-        </w:rPr>
-        <w:t>はしがき</w:t>
-      </w:r>
-    </w:p>
-    <w:p>
-      <w:pPr>
-        <w:pStyle w:val="a7"/>
-        <w:snapToGrid w:val="0"/>
-        <w:spacing w:line="240" w:lineRule="atLeast"/>
-        <w:rPr>
-          <w:rFonts w:asciiTheme="minorEastAsia" w:hAnsiTheme="minorEastAsia"/>
-          <w:sz w:val="24"/>
-        </w:rPr>
-      </w:pPr>
-    </w:p>
-    <w:p>
-      <w:pPr>
-        <w:pStyle w:val="a7"/>
-        <w:snapToGrid w:val="0"/>
-        <w:spacing w:line="240" w:lineRule="atLeast"/>
-        <w:rPr>
-          <w:rFonts w:asciiTheme="minorEastAsia" w:hAnsiTheme="minorEastAsia"/>
-          <w:sz w:val="24"/>
-        </w:rPr>
-      </w:pPr>
-      <w:r>
-        <w:rPr>
-          <w:rFonts w:asciiTheme="minorEastAsia" w:hAnsiTheme="minorEastAsia" w:hint="eastAsia"/>
-          <w:sz w:val="24"/>
-        </w:rPr>
-        <w:t>いろいろありましたね</w:t>
-      </w:r>
-    </w:p>
-    <w:p>
-      <w:pPr>
-        <w:pStyle w:val="a7"/>
-        <w:snapToGrid w:val="0"/>
-        <w:spacing w:line="240" w:lineRule="atLeast"/>
-        <w:rPr>
-          <w:rFonts w:asciiTheme="minorEastAsia" w:hAnsiTheme="minorEastAsia"/>
-          <w:sz w:val="24"/>
-        </w:rPr>
-      </w:pPr>
-      <w:r>
-        <w:rPr>
-          <w:rFonts w:asciiTheme="minorEastAsia" w:hAnsiTheme="minorEastAsia" w:hint="eastAsia"/>
-          <w:sz w:val="24"/>
-        </w:rPr>
-        <w:t>おつかれ！</w:t>
-      </w:r>
-    </w:p>
-    <w:p>
-      <w:pPr>
-        <w:pStyle w:val="a7"/>
-        <w:snapToGrid w:val="0"/>
-        <w:spacing w:line="240" w:lineRule="atLeast"/>
-        <w:rPr>
-          <w:rFonts w:asciiTheme="minorEastAsia" w:hAnsiTheme="minorEastAsia"/>
-          <w:sz w:val="24"/>
-        </w:rPr>
-      </w:pPr>
-    </w:p>
-    <w:p>
-      <w:pPr>
-        <w:pStyle w:val="a7"/>
-        <w:snapToGrid w:val="0"/>
-        <w:spacing w:line="240" w:lineRule="atLeast"/>
-        <w:rPr>
-          <w:rFonts w:asciiTheme="minorEastAsia" w:hAnsiTheme="minorEastAsia" w:hint="eastAsia"/>
-          <w:sz w:val="24"/>
-        </w:rPr>
-      </w:pPr>
-      <w:r>
-        <w:rPr>
-          <w:rFonts w:asciiTheme="minorEastAsia" w:hAnsiTheme="minorEastAsia" w:hint="eastAsia"/>
-          <w:sz w:val="24"/>
-        </w:rPr>
-        <w:t>おしまい</w:t>
-      </w:r>
+          <w:b/>
+          <w:bCs/>
+          <w:sz w:val="24"/>
+        </w:rPr>
+        <w:t>Chat GPTによる処理用</w:t>
+      </w:r>
+      <w:r>
+        <w:rPr>
+          <w:rFonts w:asciiTheme="minorEastAsia" w:hAnsiTheme="minorEastAsia"/>
+          <w:b/>
+          <w:bCs/>
+          <w:sz w:val="24"/>
+        </w:rPr>
+        <w:t>サンプル）</w:t>
+      </w:r>
+    </w:p>
+    <w:p>
+      <w:pPr>
+        <w:pStyle w:val="a7"/>
+        <w:snapToGrid w:val="0"/>
+        <w:spacing w:line="240" w:lineRule="atLeast"/>
+        <w:rPr>
+          <w:rFonts w:asciiTheme="minorEastAsia" w:hAnsiTheme="minorEastAsia"/>
+          <w:b/>
+          <w:bCs/>
+          <w:sz w:val="24"/>
+        </w:rPr>
+      </w:pPr>
+      <w:r>
+        <w:rPr>
+          <w:rFonts w:asciiTheme="minorEastAsia" w:hAnsiTheme="minorEastAsia"/>
+          <w:b/>
+          <w:bCs/>
+          <w:sz w:val="24"/>
+        </w:rPr>
+        <w:t>はじめに</w:t>
+      </w:r>
+    </w:p>
+    <w:p>
+      <w:pPr>
+        <w:pStyle w:val="a7"/>
+        <w:snapToGrid w:val="0"/>
+        <w:spacing w:line="240" w:lineRule="atLeast"/>
+        <w:rPr>
+          <w:rFonts w:asciiTheme="minorEastAsia" w:hAnsiTheme="minorEastAsia"/>
+          <w:sz w:val="24"/>
+        </w:rPr>
+      </w:pPr>
+      <w:r>
+        <w:rPr>
+          <w:rFonts w:asciiTheme="minorEastAsia" w:hAnsiTheme="minorEastAsia"/>
+          <w:sz w:val="24"/>
+        </w:rPr>
+        <w:t>本書は、複数の文書を統合し、正確なページ番号を付与したPDFを作成するためのプロセスを解説するものです。</w:t>
+      </w:r>
+      <w:r>
+        <w:rPr>
+          <w:rFonts w:asciiTheme="minorEastAsia" w:hAnsiTheme="minorEastAsia"/>
+          <w:sz w:val="24"/>
+        </w:rPr>
+        <w:br/>
+        <w:t>多くの文書を一つにまとめる際、目次の生成やページ番号の管理は煩雑になりがちですが、本書ではその一連の作業を効率化する手法を示します。</w:t>
+      </w:r>
+    </w:p>
+    <w:p>
+      <w:pPr>
+        <w:pStyle w:val="a7"/>
+        <w:snapToGrid w:val="0"/>
+        <w:spacing w:line="240" w:lineRule="atLeast"/>
+        <w:rPr>
+          <w:rFonts w:asciiTheme="minorEastAsia" w:hAnsiTheme="minorEastAsia"/>
+          <w:sz w:val="24"/>
+        </w:rPr>
+      </w:pPr>
+      <w:r>
+        <w:rPr>
+          <w:rFonts w:asciiTheme="minorEastAsia" w:hAnsiTheme="minorEastAsia"/>
+          <w:sz w:val="24"/>
+        </w:rPr>
+        <w:t>また、本書は、単に技術的な解説を行うだけではなく、</w:t>
+      </w:r>
+      <w:r>
+        <w:rPr>
+          <w:rFonts w:asciiTheme="minorEastAsia" w:hAnsiTheme="minorEastAsia"/>
+          <w:b/>
+          <w:bCs/>
+          <w:sz w:val="24"/>
+        </w:rPr>
+        <w:t>適切な文書管理とPDF作成の実践的なノウハウ</w:t>
+      </w:r>
+      <w:r>
+        <w:rPr>
+          <w:rFonts w:asciiTheme="minorEastAsia" w:hAnsiTheme="minorEastAsia"/>
+          <w:sz w:val="24"/>
+        </w:rPr>
+        <w:t xml:space="preserve"> も提供します。</w:t>
+      </w:r>
+      <w:r>
+        <w:rPr>
+          <w:rFonts w:asciiTheme="minorEastAsia" w:hAnsiTheme="minorEastAsia"/>
+          <w:sz w:val="24"/>
+        </w:rPr>
+        <w:br/>
+        <w:t>本書で取り扱うスクリプトを活用することで、業務の効率化が図れることを期待しています。</w:t>
+      </w:r>
+    </w:p>
+    <w:p>
+      <w:pPr>
+        <w:pStyle w:val="a7"/>
+        <w:snapToGrid w:val="0"/>
+        <w:spacing w:line="240" w:lineRule="atLeast"/>
+        <w:rPr>
+          <w:rFonts w:asciiTheme="minorEastAsia" w:hAnsiTheme="minorEastAsia"/>
+          <w:sz w:val="24"/>
+        </w:rPr>
+      </w:pPr>
+      <w:r>
+        <w:rPr>
+          <w:rFonts w:asciiTheme="minorEastAsia" w:hAnsiTheme="minorEastAsia"/>
+          <w:sz w:val="24"/>
+        </w:rPr>
+        <w:pict w14:anchorId="71C7425F">
+          <v:rect id="_x0000_i1025" style="width:0;height:1.5pt" o:hralign="center" o:hrstd="t" o:hr="t" fillcolor="#a0a0a0" stroked="f">
+            <v:textbox inset="5.85pt,.7pt,5.85pt,.7pt"/>
+          </v:rect>
+        </w:pict>
+      </w:r>
+    </w:p>
+    <w:p>
+      <w:pPr>
+        <w:pStyle w:val="a7"/>
+        <w:snapToGrid w:val="0"/>
+        <w:spacing w:line="240" w:lineRule="atLeast"/>
+        <w:rPr>
+          <w:rFonts w:asciiTheme="minorEastAsia" w:hAnsiTheme="minorEastAsia"/>
+          <w:b/>
+          <w:bCs/>
+          <w:sz w:val="24"/>
+        </w:rPr>
+      </w:pPr>
+      <w:r>
+        <w:rPr>
+          <w:rFonts w:asciiTheme="minorEastAsia" w:hAnsiTheme="minorEastAsia"/>
+          <w:b/>
+          <w:bCs/>
+          <w:sz w:val="24"/>
+        </w:rPr>
+        <w:t>本書の目的</w:t>
+      </w:r>
+    </w:p>
+    <w:p>
+      <w:pPr>
+        <w:pStyle w:val="a7"/>
+        <w:snapToGrid w:val="0"/>
+        <w:spacing w:line="240" w:lineRule="atLeast"/>
+        <w:rPr>
+          <w:rFonts w:asciiTheme="minorEastAsia" w:hAnsiTheme="minorEastAsia"/>
+          <w:sz w:val="24"/>
+        </w:rPr>
+      </w:pPr>
+      <w:r>
+        <w:rPr>
+          <w:rFonts w:asciiTheme="minorEastAsia" w:hAnsiTheme="minorEastAsia"/>
+          <w:sz w:val="24"/>
+        </w:rPr>
+        <w:t>本書の目的は、以下の3点に集約されます。</w:t>
+      </w:r>
+    </w:p>
+    <w:p>
+      <w:pPr>
+        <w:pStyle w:val="a7"/>
+        <w:numPr>
+          <w:ilvl w:val="0"/>
+          <w:numId w:val="1"/>
+        </w:numPr>
+        <w:snapToGrid w:val="0"/>
+        <w:spacing w:line="240" w:lineRule="atLeast"/>
+        <w:rPr>
+          <w:rFonts w:asciiTheme="minorEastAsia" w:hAnsiTheme="minorEastAsia"/>
+          <w:sz w:val="24"/>
+        </w:rPr>
+      </w:pPr>
+      <w:r>
+        <w:rPr>
+          <w:rFonts w:asciiTheme="minorEastAsia" w:hAnsiTheme="minorEastAsia"/>
+          <w:b/>
+          <w:bCs/>
+          <w:sz w:val="24"/>
+        </w:rPr>
+        <w:t>複数の文書を統合し、目次を自動生成する方法を理解する</w:t>
+      </w:r>
+    </w:p>
+    <w:p>
+      <w:pPr>
+        <w:pStyle w:val="a7"/>
+        <w:numPr>
+          <w:ilvl w:val="1"/>
+          <w:numId w:val="1"/>
+        </w:numPr>
+        <w:snapToGrid w:val="0"/>
+        <w:spacing w:line="240" w:lineRule="atLeast"/>
+        <w:rPr>
+          <w:rFonts w:asciiTheme="minorEastAsia" w:hAnsiTheme="minorEastAsia"/>
+          <w:sz w:val="24"/>
+        </w:rPr>
+      </w:pPr>
+      <w:r>
+        <w:rPr>
+          <w:rFonts w:asciiTheme="minorEastAsia" w:hAnsiTheme="minorEastAsia"/>
+          <w:sz w:val="24"/>
+        </w:rPr>
+        <w:t>Word や PDF の異なるファイルを統合する際の注意点</w:t>
+      </w:r>
+    </w:p>
+    <w:p>
+      <w:pPr>
+        <w:pStyle w:val="a7"/>
+        <w:numPr>
+          <w:ilvl w:val="1"/>
+          <w:numId w:val="1"/>
+        </w:numPr>
+        <w:snapToGrid w:val="0"/>
+        <w:spacing w:line="240" w:lineRule="atLeast"/>
+        <w:rPr>
+          <w:rFonts w:asciiTheme="minorEastAsia" w:hAnsiTheme="minorEastAsia"/>
+          <w:sz w:val="24"/>
+        </w:rPr>
+      </w:pPr>
+      <w:r>
+        <w:rPr>
+          <w:rFonts w:asciiTheme="minorEastAsia" w:hAnsiTheme="minorEastAsia"/>
+          <w:sz w:val="24"/>
+        </w:rPr>
+        <w:t>目次を正確に作成し、統一されたフォーマットで表示する方法</w:t>
+      </w:r>
+    </w:p>
+    <w:p>
+      <w:pPr>
+        <w:pStyle w:val="a7"/>
+        <w:numPr>
+          <w:ilvl w:val="0"/>
+          <w:numId w:val="1"/>
+        </w:numPr>
+        <w:snapToGrid w:val="0"/>
+        <w:spacing w:line="240" w:lineRule="atLeast"/>
+        <w:rPr>
+          <w:rFonts w:asciiTheme="minorEastAsia" w:hAnsiTheme="minorEastAsia"/>
+          <w:sz w:val="24"/>
+        </w:rPr>
+      </w:pPr>
+      <w:r>
+        <w:rPr>
+          <w:rFonts w:asciiTheme="minorEastAsia" w:hAnsiTheme="minorEastAsia"/>
+          <w:b/>
+          <w:bCs/>
+          <w:sz w:val="24"/>
+        </w:rPr>
+        <w:t>通しページ番号の設定方法を学ぶ</w:t>
+      </w:r>
+    </w:p>
+    <w:p>
+      <w:pPr>
+        <w:pStyle w:val="a7"/>
+        <w:numPr>
+          <w:ilvl w:val="1"/>
+          <w:numId w:val="1"/>
+        </w:numPr>
+        <w:snapToGrid w:val="0"/>
+        <w:spacing w:line="240" w:lineRule="atLeast"/>
+        <w:rPr>
+          <w:rFonts w:asciiTheme="minorEastAsia" w:hAnsiTheme="minorEastAsia"/>
+          <w:sz w:val="24"/>
+        </w:rPr>
+      </w:pPr>
+      <w:r>
+        <w:rPr>
+          <w:rFonts w:asciiTheme="minorEastAsia" w:hAnsiTheme="minorEastAsia"/>
+          <w:sz w:val="24"/>
+        </w:rPr>
+        <w:t>指定した文書からページ番号を付与する方法</w:t>
+      </w:r>
+    </w:p>
+    <w:p>
+      <w:pPr>
+        <w:pStyle w:val="a7"/>
+        <w:numPr>
+          <w:ilvl w:val="1"/>
+          <w:numId w:val="1"/>
+        </w:numPr>
+        <w:snapToGrid w:val="0"/>
+        <w:spacing w:line="240" w:lineRule="atLeast"/>
+        <w:rPr>
+          <w:rFonts w:asciiTheme="minorEastAsia" w:hAnsiTheme="minorEastAsia"/>
+          <w:sz w:val="24"/>
+        </w:rPr>
+      </w:pPr>
+      <w:r>
+        <w:rPr>
+          <w:rFonts w:asciiTheme="minorEastAsia" w:hAnsiTheme="minorEastAsia"/>
+          <w:sz w:val="24"/>
+        </w:rPr>
+        <w:t>異なる文書のページ数を考慮した通し番号の計算方法</w:t>
+      </w:r>
+    </w:p>
+    <w:p>
+      <w:pPr>
+        <w:pStyle w:val="a7"/>
+        <w:numPr>
+          <w:ilvl w:val="0"/>
+          <w:numId w:val="1"/>
+        </w:numPr>
+        <w:snapToGrid w:val="0"/>
+        <w:spacing w:line="240" w:lineRule="atLeast"/>
+        <w:rPr>
+          <w:rFonts w:asciiTheme="minorEastAsia" w:hAnsiTheme="minorEastAsia"/>
+          <w:sz w:val="24"/>
+        </w:rPr>
+      </w:pPr>
+      <w:r>
+        <w:rPr>
+          <w:rFonts w:asciiTheme="minorEastAsia" w:hAnsiTheme="minorEastAsia"/>
+          <w:b/>
+          <w:bCs/>
+          <w:sz w:val="24"/>
+        </w:rPr>
+        <w:t>PDFの最終的な出力を最適化する</w:t>
+      </w:r>
+    </w:p>
+    <w:p>
+      <w:pPr>
+        <w:pStyle w:val="a7"/>
+        <w:numPr>
+          <w:ilvl w:val="1"/>
+          <w:numId w:val="1"/>
+        </w:numPr>
+        <w:snapToGrid w:val="0"/>
+        <w:spacing w:line="240" w:lineRule="atLeast"/>
+        <w:rPr>
+          <w:rFonts w:asciiTheme="minorEastAsia" w:hAnsiTheme="minorEastAsia"/>
+          <w:sz w:val="24"/>
+        </w:rPr>
+      </w:pPr>
+      <w:r>
+        <w:rPr>
+          <w:rFonts w:asciiTheme="minorEastAsia" w:hAnsiTheme="minorEastAsia"/>
+          <w:sz w:val="24"/>
+        </w:rPr>
+        <w:t>ページのレイアウト調整</w:t>
+      </w:r>
+    </w:p>
+    <w:p>
+      <w:pPr>
+        <w:pStyle w:val="a7"/>
+        <w:numPr>
+          <w:ilvl w:val="1"/>
+          <w:numId w:val="1"/>
+        </w:numPr>
+        <w:snapToGrid w:val="0"/>
+        <w:spacing w:line="240" w:lineRule="atLeast"/>
+        <w:rPr>
+          <w:rFonts w:asciiTheme="minorEastAsia" w:hAnsiTheme="minorEastAsia"/>
+          <w:sz w:val="24"/>
+        </w:rPr>
+      </w:pPr>
+      <w:r>
+        <w:rPr>
+          <w:rFonts w:asciiTheme="minorEastAsia" w:hAnsiTheme="minorEastAsia"/>
+          <w:sz w:val="24"/>
+        </w:rPr>
+        <w:t>目次とページ番号を適切に同期させる方法</w:t>
+      </w:r>
+    </w:p>
+    <w:p>
+      <w:pPr>
+        <w:pStyle w:val="a7"/>
+        <w:snapToGrid w:val="0"/>
+        <w:spacing w:line="240" w:lineRule="atLeast"/>
+        <w:rPr>
+          <w:rFonts w:asciiTheme="minorEastAsia" w:hAnsiTheme="minorEastAsia"/>
+          <w:sz w:val="24"/>
+        </w:rPr>
+      </w:pPr>
+      <w:r>
+        <w:rPr>
+          <w:rFonts w:asciiTheme="minorEastAsia" w:hAnsiTheme="minorEastAsia"/>
+          <w:sz w:val="24"/>
+        </w:rPr>
+        <w:pict w14:anchorId="044A2748">
+          <v:rect id="_x0000_i1026" style="width:0;height:1.5pt" o:hralign="center" o:hrstd="t" o:hr="t" fillcolor="#a0a0a0" stroked="f">
+            <v:textbox inset="5.85pt,.7pt,5.85pt,.7pt"/>
+          </v:rect>
+        </w:pict>
+      </w:r>
+    </w:p>
+    <w:p>
+      <w:pPr>
+        <w:pStyle w:val="a7"/>
+        <w:snapToGrid w:val="0"/>
+        <w:spacing w:line="240" w:lineRule="atLeast"/>
+        <w:rPr>
+          <w:rFonts w:asciiTheme="minorEastAsia" w:hAnsiTheme="minorEastAsia"/>
+          <w:b/>
+          <w:bCs/>
+          <w:sz w:val="24"/>
+        </w:rPr>
+      </w:pPr>
+      <w:r>
+        <w:rPr>
+          <w:rFonts w:asciiTheme="minorEastAsia" w:hAnsiTheme="minorEastAsia"/>
+          <w:b/>
+          <w:bCs/>
+          <w:sz w:val="24"/>
+        </w:rPr>
+        <w:t>読者の対象</w:t>
+      </w:r>
+    </w:p>
+    <w:p>
+      <w:pPr>
+        <w:pStyle w:val="a7"/>
+        <w:snapToGrid w:val="0"/>
+        <w:spacing w:line="240" w:lineRule="atLeast"/>
+        <w:rPr>
+          <w:rFonts w:asciiTheme="minorEastAsia" w:hAnsiTheme="minorEastAsia"/>
+          <w:sz w:val="24"/>
+        </w:rPr>
+      </w:pPr>
+      <w:r>
+        <w:rPr>
+          <w:rFonts w:asciiTheme="minorEastAsia" w:hAnsiTheme="minorEastAsia"/>
+          <w:sz w:val="24"/>
+        </w:rPr>
+        <w:t>本書は、以下のような方を対象としています。</w:t>
+      </w:r>
+    </w:p>
+    <w:p>
+      <w:pPr>
+        <w:pStyle w:val="a7"/>
+        <w:numPr>
+          <w:ilvl w:val="0"/>
+          <w:numId w:val="2"/>
+        </w:numPr>
+        <w:snapToGrid w:val="0"/>
+        <w:spacing w:line="240" w:lineRule="atLeast"/>
+        <w:rPr>
+          <w:rFonts w:asciiTheme="minorEastAsia" w:hAnsiTheme="minorEastAsia"/>
+          <w:sz w:val="24"/>
+        </w:rPr>
+      </w:pPr>
+      <w:r>
+        <w:rPr>
+          <w:rFonts w:asciiTheme="minorEastAsia" w:hAnsiTheme="minorEastAsia"/>
+          <w:b/>
+          <w:bCs/>
+          <w:sz w:val="24"/>
+        </w:rPr>
+        <w:t>報告書・論文・プレゼン資料を統合して管理したい方</w:t>
+      </w:r>
+    </w:p>
+    <w:p>
+      <w:pPr>
+        <w:pStyle w:val="a7"/>
+        <w:numPr>
+          <w:ilvl w:val="0"/>
+          <w:numId w:val="2"/>
+        </w:numPr>
+        <w:snapToGrid w:val="0"/>
+        <w:spacing w:line="240" w:lineRule="atLeast"/>
+        <w:rPr>
+          <w:rFonts w:asciiTheme="minorEastAsia" w:hAnsiTheme="minorEastAsia"/>
+          <w:sz w:val="24"/>
+        </w:rPr>
+      </w:pPr>
+      <w:r>
+        <w:rPr>
+          <w:rFonts w:asciiTheme="minorEastAsia" w:hAnsiTheme="minorEastAsia"/>
+          <w:b/>
+          <w:bCs/>
+          <w:sz w:val="24"/>
+        </w:rPr>
+        <w:t>会議資料や業務用ドキュメントをPDF化し、統一した形式で保存したい方</w:t>
+      </w:r>
+    </w:p>
+    <w:p>
+      <w:pPr>
+        <w:pStyle w:val="a7"/>
+        <w:numPr>
+          <w:ilvl w:val="0"/>
+          <w:numId w:val="2"/>
+        </w:numPr>
+        <w:snapToGrid w:val="0"/>
+        <w:spacing w:line="240" w:lineRule="atLeast"/>
+        <w:rPr>
+          <w:rFonts w:asciiTheme="minorEastAsia" w:hAnsiTheme="minorEastAsia"/>
+          <w:sz w:val="24"/>
+        </w:rPr>
+      </w:pPr>
+      <w:r>
+        <w:rPr>
+          <w:rFonts w:asciiTheme="minorEastAsia" w:hAnsiTheme="minorEastAsia"/>
+          <w:b/>
+          <w:bCs/>
+          <w:sz w:val="24"/>
+        </w:rPr>
+        <w:t>Pythonを活用し、文書の処理を自動化したい方</w:t>
+      </w:r>
+    </w:p>
+    <w:p>
+      <w:pPr>
+        <w:pStyle w:val="a7"/>
+        <w:snapToGrid w:val="0"/>
+        <w:spacing w:line="240" w:lineRule="atLeast"/>
+        <w:rPr>
+          <w:rFonts w:asciiTheme="minorEastAsia" w:hAnsiTheme="minorEastAsia"/>
+          <w:sz w:val="24"/>
+        </w:rPr>
+      </w:pPr>
+      <w:r>
+        <w:rPr>
+          <w:rFonts w:asciiTheme="minorEastAsia" w:hAnsiTheme="minorEastAsia"/>
+          <w:sz w:val="24"/>
+        </w:rPr>
+        <w:t>プログラミングの知識がなくても、本書のサンプルスクリプトを実行することで、手軽にPDFの統合処理を体験できます。</w:t>
+      </w:r>
+      <w:r>
+        <w:rPr>
+          <w:rFonts w:asciiTheme="minorEastAsia" w:hAnsiTheme="minorEastAsia"/>
+          <w:sz w:val="24"/>
+        </w:rPr>
+        <w:br/>
+        <w:t>基本的なPythonの環境構築ができる方であれば、スクリプトのカスタマイズも容易に行えます。</w:t>
+      </w:r>
+    </w:p>
+    <w:p>
+      <w:pPr>
+        <w:pStyle w:val="a7"/>
+        <w:snapToGrid w:val="0"/>
+        <w:spacing w:line="240" w:lineRule="atLeast"/>
+        <w:rPr>
+          <w:rFonts w:asciiTheme="minorEastAsia" w:hAnsiTheme="minorEastAsia"/>
+          <w:sz w:val="24"/>
+        </w:rPr>
+      </w:pPr>
+      <w:r>
+        <w:rPr>
+          <w:rFonts w:asciiTheme="minorEastAsia" w:hAnsiTheme="minorEastAsia"/>
+          <w:sz w:val="24"/>
+        </w:rPr>
+        <w:pict w14:anchorId="2BD1B6DF">
+          <v:rect id="_x0000_i1027" style="width:0;height:1.5pt" o:hralign="center" o:hrstd="t" o:hr="t" fillcolor="#a0a0a0" stroked="f">
+            <v:textbox inset="5.85pt,.7pt,5.85pt,.7pt"/>
+          </v:rect>
+        </w:pict>
+      </w:r>
+    </w:p>
+    <w:p>
+      <w:pPr>
+        <w:pStyle w:val="a7"/>
+        <w:snapToGrid w:val="0"/>
+        <w:spacing w:line="240" w:lineRule="atLeast"/>
+        <w:rPr>
+          <w:rFonts w:asciiTheme="minorEastAsia" w:hAnsiTheme="minorEastAsia"/>
+          <w:b/>
+          <w:bCs/>
+          <w:sz w:val="24"/>
+        </w:rPr>
+      </w:pPr>
+      <w:r>
+        <w:rPr>
+          <w:rFonts w:asciiTheme="minorEastAsia" w:hAnsiTheme="minorEastAsia"/>
+          <w:b/>
+          <w:bCs/>
+          <w:sz w:val="24"/>
+        </w:rPr>
+        <w:t>本書の構成</w:t>
+      </w:r>
+    </w:p>
+    <w:p>
+      <w:pPr>
+        <w:pStyle w:val="a7"/>
+        <w:snapToGrid w:val="0"/>
+        <w:spacing w:line="240" w:lineRule="atLeast"/>
+        <w:rPr>
+          <w:rFonts w:asciiTheme="minorEastAsia" w:hAnsiTheme="minorEastAsia"/>
+          <w:sz w:val="24"/>
+        </w:rPr>
+      </w:pPr>
+      <w:r>
+        <w:rPr>
+          <w:rFonts w:asciiTheme="minorEastAsia" w:hAnsiTheme="minorEastAsia"/>
+          <w:sz w:val="24"/>
+        </w:rPr>
+        <w:t>本書は、以下のような流れで進めます。</w:t>
+      </w:r>
+    </w:p>
+    <w:p>
+      <w:pPr>
+        <w:pStyle w:val="a7"/>
+        <w:numPr>
+          <w:ilvl w:val="0"/>
+          <w:numId w:val="3"/>
+        </w:numPr>
+        <w:snapToGrid w:val="0"/>
+        <w:spacing w:line="240" w:lineRule="atLeast"/>
+        <w:rPr>
+          <w:rFonts w:asciiTheme="minorEastAsia" w:hAnsiTheme="minorEastAsia"/>
+          <w:sz w:val="24"/>
+        </w:rPr>
+      </w:pPr>
+      <w:r>
+        <w:rPr>
+          <w:rFonts w:asciiTheme="minorEastAsia" w:hAnsiTheme="minorEastAsia"/>
+          <w:b/>
+          <w:bCs/>
+          <w:sz w:val="24"/>
+        </w:rPr>
+        <w:lastRenderedPageBreak/>
+        <w:t>準備編</w:t>
+      </w:r>
+      <w:r>
+        <w:rPr>
+          <w:rFonts w:asciiTheme="minorEastAsia" w:hAnsiTheme="minorEastAsia"/>
+          <w:sz w:val="24"/>
+        </w:rPr>
+        <w:t xml:space="preserve"> - スクリプトの動作環境と前提条件</w:t>
+      </w:r>
+    </w:p>
+    <w:p>
+      <w:pPr>
+        <w:pStyle w:val="a7"/>
+        <w:numPr>
+          <w:ilvl w:val="0"/>
+          <w:numId w:val="3"/>
+        </w:numPr>
+        <w:snapToGrid w:val="0"/>
+        <w:spacing w:line="240" w:lineRule="atLeast"/>
+        <w:rPr>
+          <w:rFonts w:asciiTheme="minorEastAsia" w:hAnsiTheme="minorEastAsia"/>
+          <w:sz w:val="24"/>
+        </w:rPr>
+      </w:pPr>
+      <w:r>
+        <w:rPr>
+          <w:rFonts w:asciiTheme="minorEastAsia" w:hAnsiTheme="minorEastAsia"/>
+          <w:b/>
+          <w:bCs/>
+          <w:sz w:val="24"/>
+        </w:rPr>
+        <w:t>実践編</w:t>
+      </w:r>
+      <w:r>
+        <w:rPr>
+          <w:rFonts w:asciiTheme="minorEastAsia" w:hAnsiTheme="minorEastAsia"/>
+          <w:sz w:val="24"/>
+        </w:rPr>
+        <w:t xml:space="preserve"> - 文書の統合と目次の自動生成</w:t>
+      </w:r>
+    </w:p>
+    <w:p>
+      <w:pPr>
+        <w:pStyle w:val="a7"/>
+        <w:numPr>
+          <w:ilvl w:val="0"/>
+          <w:numId w:val="3"/>
+        </w:numPr>
+        <w:snapToGrid w:val="0"/>
+        <w:spacing w:line="240" w:lineRule="atLeast"/>
+        <w:rPr>
+          <w:rFonts w:asciiTheme="minorEastAsia" w:hAnsiTheme="minorEastAsia"/>
+          <w:sz w:val="24"/>
+        </w:rPr>
+      </w:pPr>
+      <w:r>
+        <w:rPr>
+          <w:rFonts w:asciiTheme="minorEastAsia" w:hAnsiTheme="minorEastAsia"/>
+          <w:b/>
+          <w:bCs/>
+          <w:sz w:val="24"/>
+        </w:rPr>
+        <w:t>応用編</w:t>
+      </w:r>
+      <w:r>
+        <w:rPr>
+          <w:rFonts w:asciiTheme="minorEastAsia" w:hAnsiTheme="minorEastAsia"/>
+          <w:sz w:val="24"/>
+        </w:rPr>
+        <w:t xml:space="preserve"> - ページ番号の管理と高度なカスタマイズ</w:t>
+      </w:r>
+    </w:p>
+    <w:p>
+      <w:pPr>
+        <w:pStyle w:val="a7"/>
+        <w:numPr>
+          <w:ilvl w:val="0"/>
+          <w:numId w:val="3"/>
+        </w:numPr>
+        <w:snapToGrid w:val="0"/>
+        <w:spacing w:line="240" w:lineRule="atLeast"/>
+        <w:rPr>
+          <w:rFonts w:asciiTheme="minorEastAsia" w:hAnsiTheme="minorEastAsia"/>
+          <w:sz w:val="24"/>
+        </w:rPr>
+      </w:pPr>
+      <w:r>
+        <w:rPr>
+          <w:rFonts w:asciiTheme="minorEastAsia" w:hAnsiTheme="minorEastAsia"/>
+          <w:b/>
+          <w:bCs/>
+          <w:sz w:val="24"/>
+        </w:rPr>
+        <w:t>補足</w:t>
+      </w:r>
+      <w:r>
+        <w:rPr>
+          <w:rFonts w:asciiTheme="minorEastAsia" w:hAnsiTheme="minorEastAsia"/>
+          <w:sz w:val="24"/>
+        </w:rPr>
+        <w:t xml:space="preserve"> - よくある問題とその対処法</w:t>
+      </w:r>
+    </w:p>
+    <w:p>
+      <w:pPr>
+        <w:pStyle w:val="a7"/>
+        <w:snapToGrid w:val="0"/>
+        <w:spacing w:line="240" w:lineRule="atLeast"/>
+        <w:rPr>
+          <w:rFonts w:asciiTheme="minorEastAsia" w:hAnsiTheme="minorEastAsia"/>
+          <w:sz w:val="24"/>
+        </w:rPr>
+      </w:pPr>
+      <w:r>
+        <w:rPr>
+          <w:rFonts w:asciiTheme="minorEastAsia" w:hAnsiTheme="minorEastAsia"/>
+          <w:sz w:val="24"/>
+        </w:rPr>
+        <w:t>この構成を通じて、</w:t>
+      </w:r>
+      <w:r>
+        <w:rPr>
+          <w:rFonts w:asciiTheme="minorEastAsia" w:hAnsiTheme="minorEastAsia"/>
+          <w:b/>
+          <w:bCs/>
+          <w:sz w:val="24"/>
+        </w:rPr>
+        <w:t>単なるコードの解説にとどまらず、実際の業務に活用できる知識</w:t>
+      </w:r>
+      <w:r>
+        <w:rPr>
+          <w:rFonts w:asciiTheme="minorEastAsia" w:hAnsiTheme="minorEastAsia"/>
+          <w:sz w:val="24"/>
+        </w:rPr>
+        <w:t xml:space="preserve"> を習得できるようにしました。</w:t>
+      </w:r>
+    </w:p>
+    <w:p>
+      <w:pPr>
+        <w:pStyle w:val="a7"/>
+        <w:snapToGrid w:val="0"/>
+        <w:spacing w:line="240" w:lineRule="atLeast"/>
+        <w:rPr>
+          <w:rFonts w:asciiTheme="minorEastAsia" w:hAnsiTheme="minorEastAsia"/>
+          <w:sz w:val="24"/>
+        </w:rPr>
+      </w:pPr>
+      <w:r>
+        <w:rPr>
+          <w:rFonts w:asciiTheme="minorEastAsia" w:hAnsiTheme="minorEastAsia"/>
+          <w:sz w:val="24"/>
+        </w:rPr>
+        <w:pict w14:anchorId="276147F4">
+          <v:rect id="_x0000_i1028" style="width:0;height:1.5pt" o:hralign="center" o:hrstd="t" o:hr="t" fillcolor="#a0a0a0" stroked="f">
+            <v:textbox inset="5.85pt,.7pt,5.85pt,.7pt"/>
+          </v:rect>
+        </w:pict>
+      </w:r>
+    </w:p>
+    <w:p>
+      <w:pPr>
+        <w:pStyle w:val="a7"/>
+        <w:snapToGrid w:val="0"/>
+        <w:spacing w:line="240" w:lineRule="atLeast"/>
+        <w:rPr>
+          <w:rFonts w:asciiTheme="minorEastAsia" w:hAnsiTheme="minorEastAsia"/>
+          <w:b/>
+          <w:bCs/>
+          <w:sz w:val="24"/>
+        </w:rPr>
+      </w:pPr>
+      <w:r>
+        <w:rPr>
+          <w:rFonts w:asciiTheme="minorEastAsia" w:hAnsiTheme="minorEastAsia"/>
+          <w:b/>
+          <w:bCs/>
+          <w:sz w:val="24"/>
+        </w:rPr>
+        <w:t>おわりに</w:t>
+      </w:r>
+    </w:p>
+    <w:p>
+      <w:pPr>
+        <w:pStyle w:val="a7"/>
+        <w:snapToGrid w:val="0"/>
+        <w:spacing w:line="240" w:lineRule="atLeast"/>
+        <w:rPr>
+          <w:rFonts w:asciiTheme="minorEastAsia" w:hAnsiTheme="minorEastAsia"/>
+          <w:sz w:val="24"/>
+        </w:rPr>
+      </w:pPr>
+      <w:r>
+        <w:rPr>
+          <w:rFonts w:asciiTheme="minorEastAsia" w:hAnsiTheme="minorEastAsia"/>
+          <w:sz w:val="24"/>
+        </w:rPr>
+        <w:t>文書の統合とページ番号管理は、単純なようで意外に手間がかかる作業です。</w:t>
+      </w:r>
+      <w:r>
+        <w:rPr>
+          <w:rFonts w:asciiTheme="minorEastAsia" w:hAnsiTheme="minorEastAsia"/>
+          <w:sz w:val="24"/>
+        </w:rPr>
+        <w:br/>
+        <w:t>しかし、</w:t>
+      </w:r>
+      <w:r>
+        <w:rPr>
+          <w:rFonts w:asciiTheme="minorEastAsia" w:hAnsiTheme="minorEastAsia"/>
+          <w:b/>
+          <w:bCs/>
+          <w:sz w:val="24"/>
+        </w:rPr>
+        <w:t>適切なツールとスクリプトを用いることで、煩雑な作業を自動化し、業務の効率を向上させることが可能</w:t>
+      </w:r>
+      <w:r>
+        <w:rPr>
+          <w:rFonts w:asciiTheme="minorEastAsia" w:hAnsiTheme="minorEastAsia"/>
+          <w:sz w:val="24"/>
+        </w:rPr>
+        <w:t xml:space="preserve"> です。</w:t>
+      </w:r>
+    </w:p>
+    <w:p>
+      <w:pPr>
+        <w:pStyle w:val="a7"/>
+        <w:snapToGrid w:val="0"/>
+        <w:spacing w:line="240" w:lineRule="atLeast"/>
+        <w:rPr>
+          <w:rFonts w:asciiTheme="minorEastAsia" w:hAnsiTheme="minorEastAsia"/>
+          <w:sz w:val="24"/>
+        </w:rPr>
+      </w:pPr>
+      <w:r>
+        <w:rPr>
+          <w:rFonts w:asciiTheme="minorEastAsia" w:hAnsiTheme="minorEastAsia"/>
+          <w:sz w:val="24"/>
+        </w:rPr>
+        <w:t>本書で紹介する手法を活用し、</w:t>
+      </w:r>
+      <w:r>
+        <w:rPr>
+          <w:rFonts w:asciiTheme="minorEastAsia" w:hAnsiTheme="minorEastAsia"/>
+          <w:b/>
+          <w:bCs/>
+          <w:sz w:val="24"/>
+        </w:rPr>
+        <w:t>よりスムーズな文書管理を実現</w:t>
+      </w:r>
+      <w:r>
+        <w:rPr>
+          <w:rFonts w:asciiTheme="minorEastAsia" w:hAnsiTheme="minorEastAsia"/>
+          <w:sz w:val="24"/>
+        </w:rPr>
+        <w:t xml:space="preserve"> していただければ幸いです。</w:t>
+      </w:r>
+    </w:p>
+    <w:p>
+      <w:pPr>
+        <w:pStyle w:val="a7"/>
+        <w:snapToGrid w:val="0"/>
+        <w:spacing w:line="240" w:lineRule="atLeast"/>
+        <w:rPr>
+          <w:rFonts w:asciiTheme="minorEastAsia" w:hAnsiTheme="minorEastAsia"/>
+          <w:sz w:val="24"/>
+        </w:rPr>
+      </w:pPr>
+      <w:r>
+        <w:rPr>
+          <w:rFonts w:asciiTheme="minorEastAsia" w:hAnsiTheme="minorEastAsia"/>
+          <w:sz w:val="24"/>
+        </w:rPr>
+        <w:pict w14:anchorId="5A12254B">
+          <v:rect id="_x0000_i1029" style="width:0;height:1.5pt" o:hralign="center" o:hrstd="t" o:hr="t" fillcolor="#a0a0a0" stroked="f">
+            <v:textbox inset="5.85pt,.7pt,5.85pt,.7pt"/>
+          </v:rect>
+        </w:pict>
+      </w:r>
+    </w:p>
+    <w:p>
+      <w:pPr>
+        <w:pStyle w:val="a7"/>
+        <w:snapToGrid w:val="0"/>
+        <w:spacing w:line="240" w:lineRule="atLeast"/>
+        <w:rPr>
+          <w:rFonts w:asciiTheme="minorEastAsia" w:hAnsiTheme="minorEastAsia"/>
+          <w:sz w:val="24"/>
+        </w:rPr>
+      </w:pPr>
+      <w:r>
+        <w:rPr>
+          <w:rFonts w:ascii="Segoe UI Emoji" w:hAnsi="Segoe UI Emoji" w:cs="Segoe UI Emoji"/>
+          <w:sz w:val="24"/>
+        </w:rPr>
+        <w:t>💡</w:t>
+      </w:r>
+      <w:r>
+        <w:rPr>
+          <w:rFonts w:asciiTheme="minorEastAsia" w:hAnsiTheme="minorEastAsia"/>
+          <w:sz w:val="24"/>
+        </w:rPr>
+        <w:t xml:space="preserve"> </w:t>
+      </w:r>
+      <w:r>
+        <w:rPr>
+          <w:rFonts w:asciiTheme="minorEastAsia" w:hAnsiTheme="minorEastAsia"/>
+          <w:b/>
+          <w:bCs/>
+          <w:sz w:val="24"/>
+        </w:rPr>
+        <w:t>この「はしがき」はA4 2ページ程度の分量を想定しています。</w:t>
+      </w:r>
+      <w:r>
+        <w:rPr>
+          <w:rFonts w:asciiTheme="minorEastAsia" w:hAnsiTheme="minorEastAsia"/>
+          <w:sz w:val="24"/>
+        </w:rPr>
+        <w:br/>
+        <w:t>この内容を適用し、PDFのサンプルに組み込むことも可能です。</w:t>
+      </w:r>
+      <w:r>
+        <w:rPr>
+          <w:rFonts w:asciiTheme="minorEastAsia" w:hAnsiTheme="minorEastAsia"/>
+          <w:sz w:val="24"/>
+        </w:rPr>
+        <w:br/>
+        <w:t xml:space="preserve">もし、文体の変更や特定のトピックの追加が必要であれば、お知らせください！ </w:t>
+      </w:r>
+      <w:r>
+        <w:rPr>
+          <w:rFonts w:ascii="Segoe UI Emoji" w:hAnsi="Segoe UI Emoji" w:cs="Segoe UI Emoji"/>
+          <w:sz w:val="24"/>
+        </w:rPr>
+        <w:t>🚀</w:t>
+      </w:r>
+    </w:p>
+    <w:p>
+      <w:pPr>
+        <w:pStyle w:val="a7"/>
+        <w:snapToGrid w:val="0"/>
+        <w:spacing w:line="240" w:lineRule="atLeast"/>
+        <w:rPr>
+          <w:rFonts w:asciiTheme="minorEastAsia" w:hAnsiTheme="minorEastAsia"/>
+          <w:sz w:val="24"/>
+        </w:rPr>
+      </w:pPr>
     </w:p>
     <w:sectPr>
       <w:pgSz w:w="11906" w:h="16838"/>
@@ -107,7 +1000,7 @@
 </file>
 
 <file path=word/endnotes.xml><?xml version="1.0" encoding="utf-8"?>
-<w:endnotes xmlns:wpc="http://schemas.microsoft.com/office/word/2010/wordprocessingCanvas" xmlns:cx="http://schemas.microsoft.com/office/drawing/2014/chartex" xmlns:cx1="http://schemas.microsoft.com/office/drawing/2015/9/8/chartex" xmlns:cx2="http://schemas.microsoft.com/office/drawing/2015/10/21/chartex" xmlns:cx3="http://schemas.microsoft.com/office/drawing/2016/5/9/chartex" xmlns:cx4="http://schemas.microsoft.com/office/drawing/2016/5/10/chartex" xmlns:cx5="http://schemas.microsoft.com/office/drawing/2016/5/11/chartex" xmlns:cx6="http://schemas.microsoft.com/office/drawing/2016/5/12/chartex" xmlns:cx7="http://schemas.microsoft.com/office/drawing/2016/5/13/chartex" xmlns:cx8="http://schemas.microsoft.com/office/drawing/2016/5/14/chartex" xmlns:mc="http://schemas.openxmlformats.org/markup-compatibility/2006" xmlns:aink="http://schemas.microsoft.com/office/drawing/2016/ink" xmlns:am3d="http://schemas.microsoft.com/office/drawing/2017/model3d" xmlns:o="urn:schemas-microsoft-com:office:office" xmlns:oel="http://schemas.microsoft.com/office/2019/extlst" xmlns:r="http://schemas.openxmlformats.org/officeDocument/2006/relationships" xmlns:m="http://schemas.openxmlformats.org/officeDocument/2006/math" xmlns:v="urn:schemas-microsoft-com:vml" xmlns:wp14="http://schemas.microsoft.com/office/word/2010/wordprocessingDrawing" xmlns:wp="http://schemas.openxmlformats.org/drawingml/2006/wordprocessingDrawing" xmlns:w10="urn:schemas-microsoft-com:office:word" xmlns:w="http://schemas.openxmlformats.org/wordprocessingml/2006/main" xmlns:w14="http://schemas.microsoft.com/office/word/2010/wordml" xmlns:w15="http://schemas.microsoft.com/office/word/2012/wordml" xmlns:w16cex="http://schemas.microsoft.com/office/word/2018/wordml/cex" xmlns:w16cid="http://schemas.microsoft.com/office/word/2016/wordml/cid" xmlns:w16="http://schemas.microsoft.com/office/word/2018/wordml" xmlns:w16du="http://schemas.microsoft.com/office/word/2023/wordml/word16du" xmlns:w16sdtdh="http://schemas.microsoft.com/office/word/2020/wordml/sdtdatahash" xmlns:w16se="http://schemas.microsoft.com/office/word/2015/wordml/symex" xmlns:wpg="http://schemas.microsoft.com/office/word/2010/wordprocessingGroup" xmlns:wpi="http://schemas.microsoft.com/office/word/2010/wordprocessingInk" xmlns:wne="http://schemas.microsoft.com/office/word/2006/wordml" xmlns:wps="http://schemas.microsoft.com/office/word/2010/wordprocessingShape" mc:Ignorable="w14 w15 w16se w16cid w16 w16cex w16sdtdh w16du wp14">
+<w:endnotes xmlns:wpc="http://schemas.microsoft.com/office/word/2010/wordprocessingCanvas" xmlns:cx="http://schemas.microsoft.com/office/drawing/2014/chartex" xmlns:cx1="http://schemas.microsoft.com/office/drawing/2015/9/8/chartex" xmlns:cx2="http://schemas.microsoft.com/office/drawing/2015/10/21/chartex" xmlns:cx3="http://schemas.microsoft.com/office/drawing/2016/5/9/chartex" xmlns:cx4="http://schemas.microsoft.com/office/drawing/2016/5/10/chartex" xmlns:cx5="http://schemas.microsoft.com/office/drawing/2016/5/11/chartex" xmlns:cx6="http://schemas.microsoft.com/office/drawing/2016/5/12/chartex" xmlns:cx7="http://schemas.microsoft.com/office/drawing/2016/5/13/chartex" xmlns:cx8="http://schemas.microsoft.com/office/drawing/2016/5/14/chartex" xmlns:mc="http://schemas.openxmlformats.org/markup-compatibility/2006" xmlns:aink="http://schemas.microsoft.com/office/drawing/2016/ink" xmlns:am3d="http://schemas.microsoft.com/office/drawing/2017/model3d" xmlns:o="urn:schemas-microsoft-com:office:office" xmlns:oel="http://schemas.microsoft.com/office/2019/extlst" xmlns:r="http://schemas.openxmlformats.org/officeDocument/2006/relationships" xmlns:m="http://schemas.openxmlformats.org/officeDocument/2006/math" xmlns:v="urn:schemas-microsoft-com:vml" xmlns:wp14="http://schemas.microsoft.com/office/word/2010/wordprocessingDrawing" xmlns:wp="http://schemas.openxmlformats.org/drawingml/2006/wordprocessingDrawing" xmlns:w10="urn:schemas-microsoft-com:office:word" xmlns:w="http://schemas.openxmlformats.org/wordprocessingml/2006/main" xmlns:w14="http://schemas.microsoft.com/office/word/2010/wordml" xmlns:w15="http://schemas.microsoft.com/office/word/2012/wordml" xmlns:w16cex="http://schemas.microsoft.com/office/word/2018/wordml/cex" xmlns:w16cid="http://schemas.microsoft.com/office/word/2016/wordml/cid" xmlns:w16="http://schemas.microsoft.com/office/word/2018/wordml" xmlns:w16du="http://schemas.microsoft.com/office/word/2023/wordml/word16du" xmlns:w16sdtdh="http://schemas.microsoft.com/office/word/2020/wordml/sdtdatahash" xmlns:w16sdtfl="http://schemas.microsoft.com/office/word/2024/wordml/sdtformatlock" xmlns:w16se="http://schemas.microsoft.com/office/word/2015/wordml/symex" xmlns:wpg="http://schemas.microsoft.com/office/word/2010/wordprocessingGroup" xmlns:wpi="http://schemas.microsoft.com/office/word/2010/wordprocessingInk" xmlns:wne="http://schemas.microsoft.com/office/word/2006/wordml" xmlns:wps="http://schemas.microsoft.com/office/word/2010/wordprocessingShape" mc:Ignorable="w14 w15 w16se w16cid w16 w16cex w16sdtdh w16sdtfl w16du wp14">
   <w:endnote w:type="separator" w:id="-1">
     <w:p>
       <w:pPr>
@@ -132,7 +1025,7 @@
 </file>
 
 <file path=word/footnotes.xml><?xml version="1.0" encoding="utf-8"?>
-<w:footnotes xmlns:wpc="http://schemas.microsoft.com/office/word/2010/wordprocessingCanvas" xmlns:cx="http://schemas.microsoft.com/office/drawing/2014/chartex" xmlns:cx1="http://schemas.microsoft.com/office/drawing/2015/9/8/chartex" xmlns:cx2="http://schemas.microsoft.com/office/drawing/2015/10/21/chartex" xmlns:cx3="http://schemas.microsoft.com/office/drawing/2016/5/9/chartex" xmlns:cx4="http://schemas.microsoft.com/office/drawing/2016/5/10/chartex" xmlns:cx5="http://schemas.microsoft.com/office/drawing/2016/5/11/chartex" xmlns:cx6="http://schemas.microsoft.com/office/drawing/2016/5/12/chartex" xmlns:cx7="http://schemas.microsoft.com/office/drawing/2016/5/13/chartex" xmlns:cx8="http://schemas.microsoft.com/office/drawing/2016/5/14/chartex" xmlns:mc="http://schemas.openxmlformats.org/markup-compatibility/2006" xmlns:aink="http://schemas.microsoft.com/office/drawing/2016/ink" xmlns:am3d="http://schemas.microsoft.com/office/drawing/2017/model3d" xmlns:o="urn:schemas-microsoft-com:office:office" xmlns:oel="http://schemas.microsoft.com/office/2019/extlst" xmlns:r="http://schemas.openxmlformats.org/officeDocument/2006/relationships" xmlns:m="http://schemas.openxmlformats.org/officeDocument/2006/math" xmlns:v="urn:schemas-microsoft-com:vml" xmlns:wp14="http://schemas.microsoft.com/office/word/2010/wordprocessingDrawing" xmlns:wp="http://schemas.openxmlformats.org/drawingml/2006/wordprocessingDrawing" xmlns:w10="urn:schemas-microsoft-com:office:word" xmlns:w="http://schemas.openxmlformats.org/wordprocessingml/2006/main" xmlns:w14="http://schemas.microsoft.com/office/word/2010/wordml" xmlns:w15="http://schemas.microsoft.com/office/word/2012/wordml" xmlns:w16cex="http://schemas.microsoft.com/office/word/2018/wordml/cex" xmlns:w16cid="http://schemas.microsoft.com/office/word/2016/wordml/cid" xmlns:w16="http://schemas.microsoft.com/office/word/2018/wordml" xmlns:w16du="http://schemas.microsoft.com/office/word/2023/wordml/word16du" xmlns:w16sdtdh="http://schemas.microsoft.com/office/word/2020/wordml/sdtdatahash" xmlns:w16se="http://schemas.microsoft.com/office/word/2015/wordml/symex" xmlns:wpg="http://schemas.microsoft.com/office/word/2010/wordprocessingGroup" xmlns:wpi="http://schemas.microsoft.com/office/word/2010/wordprocessingInk" xmlns:wne="http://schemas.microsoft.com/office/word/2006/wordml" xmlns:wps="http://schemas.microsoft.com/office/word/2010/wordprocessingShape" mc:Ignorable="w14 w15 w16se w16cid w16 w16cex w16sdtdh w16du wp14">
+<w:footnotes xmlns:wpc="http://schemas.microsoft.com/office/word/2010/wordprocessingCanvas" xmlns:cx="http://schemas.microsoft.com/office/drawing/2014/chartex" xmlns:cx1="http://schemas.microsoft.com/office/drawing/2015/9/8/chartex" xmlns:cx2="http://schemas.microsoft.com/office/drawing/2015/10/21/chartex" xmlns:cx3="http://schemas.microsoft.com/office/drawing/2016/5/9/chartex" xmlns:cx4="http://schemas.microsoft.com/office/drawing/2016/5/10/chartex" xmlns:cx5="http://schemas.microsoft.com/office/drawing/2016/5/11/chartex" xmlns:cx6="http://schemas.microsoft.com/office/drawing/2016/5/12/chartex" xmlns:cx7="http://schemas.microsoft.com/office/drawing/2016/5/13/chartex" xmlns:cx8="http://schemas.microsoft.com/office/drawing/2016/5/14/chartex" xmlns:mc="http://schemas.openxmlformats.org/markup-compatibility/2006" xmlns:aink="http://schemas.microsoft.com/office/drawing/2016/ink" xmlns:am3d="http://schemas.microsoft.com/office/drawing/2017/model3d" xmlns:o="urn:schemas-microsoft-com:office:office" xmlns:oel="http://schemas.microsoft.com/office/2019/extlst" xmlns:r="http://schemas.openxmlformats.org/officeDocument/2006/relationships" xmlns:m="http://schemas.openxmlformats.org/officeDocument/2006/math" xmlns:v="urn:schemas-microsoft-com:vml" xmlns:wp14="http://schemas.microsoft.com/office/word/2010/wordprocessingDrawing" xmlns:wp="http://schemas.openxmlformats.org/drawingml/2006/wordprocessingDrawing" xmlns:w10="urn:schemas-microsoft-com:office:word" xmlns:w="http://schemas.openxmlformats.org/wordprocessingml/2006/main" xmlns:w14="http://schemas.microsoft.com/office/word/2010/wordml" xmlns:w15="http://schemas.microsoft.com/office/word/2012/wordml" xmlns:w16cex="http://schemas.microsoft.com/office/word/2018/wordml/cex" xmlns:w16cid="http://schemas.microsoft.com/office/word/2016/wordml/cid" xmlns:w16="http://schemas.microsoft.com/office/word/2018/wordml" xmlns:w16du="http://schemas.microsoft.com/office/word/2023/wordml/word16du" xmlns:w16sdtdh="http://schemas.microsoft.com/office/word/2020/wordml/sdtdatahash" xmlns:w16sdtfl="http://schemas.microsoft.com/office/word/2024/wordml/sdtformatlock" xmlns:w16se="http://schemas.microsoft.com/office/word/2015/wordml/symex" xmlns:wpg="http://schemas.microsoft.com/office/word/2010/wordprocessingGroup" xmlns:wpi="http://schemas.microsoft.com/office/word/2010/wordprocessingInk" xmlns:wne="http://schemas.microsoft.com/office/word/2006/wordml" xmlns:wps="http://schemas.microsoft.com/office/word/2010/wordprocessingShape" mc:Ignorable="w14 w15 w16se w16cid w16 w16cex w16sdtdh w16sdtfl w16du wp14">
   <w:footnote w:type="separator" w:id="-1">
     <w:p>
       <w:pPr>
@@ -156,8 +1049,401 @@
 </w:footnotes>
 </file>
 
+<file path=word/numbering.xml><?xml version="1.0" encoding="utf-8"?>
+<w:numbering xmlns:wpc="http://schemas.microsoft.com/office/word/2010/wordprocessingCanvas" xmlns:cx="http://schemas.microsoft.com/office/drawing/2014/chartex" xmlns:cx1="http://schemas.microsoft.com/office/drawing/2015/9/8/chartex" xmlns:cx2="http://schemas.microsoft.com/office/drawing/2015/10/21/chartex" xmlns:cx3="http://schemas.microsoft.com/office/drawing/2016/5/9/chartex" xmlns:cx4="http://schemas.microsoft.com/office/drawing/2016/5/10/chartex" xmlns:cx5="http://schemas.microsoft.com/office/drawing/2016/5/11/chartex" xmlns:cx6="http://schemas.microsoft.com/office/drawing/2016/5/12/chartex" xmlns:cx7="http://schemas.microsoft.com/office/drawing/2016/5/13/chartex" xmlns:cx8="http://schemas.microsoft.com/office/drawing/2016/5/14/chartex" xmlns:mc="http://schemas.openxmlformats.org/markup-compatibility/2006" xmlns:aink="http://schemas.microsoft.com/office/drawing/2016/ink" xmlns:am3d="http://schemas.microsoft.com/office/drawing/2017/model3d" xmlns:o="urn:schemas-microsoft-com:office:office" xmlns:oel="http://schemas.microsoft.com/office/2019/extlst" xmlns:r="http://schemas.openxmlformats.org/officeDocument/2006/relationships" xmlns:m="http://schemas.openxmlformats.org/officeDocument/2006/math" xmlns:v="urn:schemas-microsoft-com:vml" xmlns:wp14="http://schemas.microsoft.com/office/word/2010/wordprocessingDrawing" xmlns:wp="http://schemas.openxmlformats.org/drawingml/2006/wordprocessingDrawing" xmlns:w10="urn:schemas-microsoft-com:office:word" xmlns:w="http://schemas.openxmlformats.org/wordprocessingml/2006/main" xmlns:w14="http://schemas.microsoft.com/office/word/2010/wordml" xmlns:w15="http://schemas.microsoft.com/office/word/2012/wordml" xmlns:w16cex="http://schemas.microsoft.com/office/word/2018/wordml/cex" xmlns:w16cid="http://schemas.microsoft.com/office/word/2016/wordml/cid" xmlns:w16="http://schemas.microsoft.com/office/word/2018/wordml" xmlns:w16du="http://schemas.microsoft.com/office/word/2023/wordml/word16du" xmlns:w16sdtdh="http://schemas.microsoft.com/office/word/2020/wordml/sdtdatahash" xmlns:w16sdtfl="http://schemas.microsoft.com/office/word/2024/wordml/sdtformatlock" xmlns:w16se="http://schemas.microsoft.com/office/word/2015/wordml/symex" xmlns:wpg="http://schemas.microsoft.com/office/word/2010/wordprocessingGroup" xmlns:wpi="http://schemas.microsoft.com/office/word/2010/wordprocessingInk" xmlns:wne="http://schemas.microsoft.com/office/word/2006/wordml" xmlns:wps="http://schemas.microsoft.com/office/word/2010/wordprocessingShape" mc:Ignorable="w14 w15 w16se w16cid w16 w16cex w16sdtdh w16sdtfl w16du wp14">
+  <w:abstractNum w:abstractNumId="0" w15:restartNumberingAfterBreak="0">
+    <w:nsid w:val="3CBF389C"/>
+    <w:multiLevelType w:val="multilevel"/>
+    <w:tmpl w:val="D5B287EE"/>
+    <w:lvl w:ilvl="0">
+      <w:start w:val="1"/>
+      <w:numFmt w:val="decimal"/>
+      <w:lvlText w:val="%1."/>
+      <w:lvlJc w:val="left"/>
+      <w:pPr>
+        <w:tabs>
+          <w:tab w:val="num" w:pos="720"/>
+        </w:tabs>
+        <w:ind w:left="720" w:hanging="360"/>
+      </w:pPr>
+    </w:lvl>
+    <w:lvl w:ilvl="1">
+      <w:start w:val="1"/>
+      <w:numFmt w:val="bullet"/>
+      <w:lvlText w:val="o"/>
+      <w:lvlJc w:val="left"/>
+      <w:pPr>
+        <w:tabs>
+          <w:tab w:val="num" w:pos="1440"/>
+        </w:tabs>
+        <w:ind w:left="1440" w:hanging="360"/>
+      </w:pPr>
+      <w:rPr>
+        <w:rFonts w:ascii="Courier New" w:hAnsi="Courier New" w:hint="default"/>
+        <w:sz w:val="20"/>
+      </w:rPr>
+    </w:lvl>
+    <w:lvl w:ilvl="2" w:tentative="1">
+      <w:start w:val="1"/>
+      <w:numFmt w:val="decimal"/>
+      <w:lvlText w:val="%3."/>
+      <w:lvlJc w:val="left"/>
+      <w:pPr>
+        <w:tabs>
+          <w:tab w:val="num" w:pos="2160"/>
+        </w:tabs>
+        <w:ind w:left="2160" w:hanging="360"/>
+      </w:pPr>
+    </w:lvl>
+    <w:lvl w:ilvl="3" w:tentative="1">
+      <w:start w:val="1"/>
+      <w:numFmt w:val="decimal"/>
+      <w:lvlText w:val="%4."/>
+      <w:lvlJc w:val="left"/>
+      <w:pPr>
+        <w:tabs>
+          <w:tab w:val="num" w:pos="2880"/>
+        </w:tabs>
+        <w:ind w:left="2880" w:hanging="360"/>
+      </w:pPr>
+    </w:lvl>
+    <w:lvl w:ilvl="4" w:tentative="1">
+      <w:start w:val="1"/>
+      <w:numFmt w:val="decimal"/>
+      <w:lvlText w:val="%5."/>
+      <w:lvlJc w:val="left"/>
+      <w:pPr>
+        <w:tabs>
+          <w:tab w:val="num" w:pos="3600"/>
+        </w:tabs>
+        <w:ind w:left="3600" w:hanging="360"/>
+      </w:pPr>
+    </w:lvl>
+    <w:lvl w:ilvl="5" w:tentative="1">
+      <w:start w:val="1"/>
+      <w:numFmt w:val="decimal"/>
+      <w:lvlText w:val="%6."/>
+      <w:lvlJc w:val="left"/>
+      <w:pPr>
+        <w:tabs>
+          <w:tab w:val="num" w:pos="4320"/>
+        </w:tabs>
+        <w:ind w:left="4320" w:hanging="360"/>
+      </w:pPr>
+    </w:lvl>
+    <w:lvl w:ilvl="6" w:tentative="1">
+      <w:start w:val="1"/>
+      <w:numFmt w:val="decimal"/>
+      <w:lvlText w:val="%7."/>
+      <w:lvlJc w:val="left"/>
+      <w:pPr>
+        <w:tabs>
+          <w:tab w:val="num" w:pos="5040"/>
+        </w:tabs>
+        <w:ind w:left="5040" w:hanging="360"/>
+      </w:pPr>
+    </w:lvl>
+    <w:lvl w:ilvl="7" w:tentative="1">
+      <w:start w:val="1"/>
+      <w:numFmt w:val="decimal"/>
+      <w:lvlText w:val="%8."/>
+      <w:lvlJc w:val="left"/>
+      <w:pPr>
+        <w:tabs>
+          <w:tab w:val="num" w:pos="5760"/>
+        </w:tabs>
+        <w:ind w:left="5760" w:hanging="360"/>
+      </w:pPr>
+    </w:lvl>
+    <w:lvl w:ilvl="8" w:tentative="1">
+      <w:start w:val="1"/>
+      <w:numFmt w:val="decimal"/>
+      <w:lvlText w:val="%9."/>
+      <w:lvlJc w:val="left"/>
+      <w:pPr>
+        <w:tabs>
+          <w:tab w:val="num" w:pos="6480"/>
+        </w:tabs>
+        <w:ind w:left="6480" w:hanging="360"/>
+      </w:pPr>
+    </w:lvl>
+  </w:abstractNum>
+  <w:abstractNum w:abstractNumId="1" w15:restartNumberingAfterBreak="0">
+    <w:nsid w:val="5E0F2D41"/>
+    <w:multiLevelType w:val="multilevel"/>
+    <w:tmpl w:val="8710DD0A"/>
+    <w:lvl w:ilvl="0">
+      <w:start w:val="1"/>
+      <w:numFmt w:val="bullet"/>
+      <w:lvlText w:val=""/>
+      <w:lvlJc w:val="left"/>
+      <w:pPr>
+        <w:tabs>
+          <w:tab w:val="num" w:pos="720"/>
+        </w:tabs>
+        <w:ind w:left="720" w:hanging="360"/>
+      </w:pPr>
+      <w:rPr>
+        <w:rFonts w:ascii="Symbol" w:hAnsi="Symbol" w:hint="default"/>
+        <w:sz w:val="20"/>
+      </w:rPr>
+    </w:lvl>
+    <w:lvl w:ilvl="1" w:tentative="1">
+      <w:start w:val="1"/>
+      <w:numFmt w:val="bullet"/>
+      <w:lvlText w:val="o"/>
+      <w:lvlJc w:val="left"/>
+      <w:pPr>
+        <w:tabs>
+          <w:tab w:val="num" w:pos="1440"/>
+        </w:tabs>
+        <w:ind w:left="1440" w:hanging="360"/>
+      </w:pPr>
+      <w:rPr>
+        <w:rFonts w:ascii="Courier New" w:hAnsi="Courier New" w:hint="default"/>
+        <w:sz w:val="20"/>
+      </w:rPr>
+    </w:lvl>
+    <w:lvl w:ilvl="2" w:tentative="1">
+      <w:start w:val="1"/>
+      <w:numFmt w:val="bullet"/>
+      <w:lvlText w:val=""/>
+      <w:lvlJc w:val="left"/>
+      <w:pPr>
+        <w:tabs>
+          <w:tab w:val="num" w:pos="2160"/>
+        </w:tabs>
+        <w:ind w:left="2160" w:hanging="360"/>
+      </w:pPr>
+      <w:rPr>
+        <w:rFonts w:ascii="Wingdings" w:hAnsi="Wingdings" w:hint="default"/>
+        <w:sz w:val="20"/>
+      </w:rPr>
+    </w:lvl>
+    <w:lvl w:ilvl="3" w:tentative="1">
+      <w:start w:val="1"/>
+      <w:numFmt w:val="bullet"/>
+      <w:lvlText w:val=""/>
+      <w:lvlJc w:val="left"/>
+      <w:pPr>
+        <w:tabs>
+          <w:tab w:val="num" w:pos="2880"/>
+        </w:tabs>
+        <w:ind w:left="2880" w:hanging="360"/>
+      </w:pPr>
+      <w:rPr>
+        <w:rFonts w:ascii="Wingdings" w:hAnsi="Wingdings" w:hint="default"/>
+        <w:sz w:val="20"/>
+      </w:rPr>
+    </w:lvl>
+    <w:lvl w:ilvl="4" w:tentative="1">
+      <w:start w:val="1"/>
+      <w:numFmt w:val="bullet"/>
+      <w:lvlText w:val=""/>
+      <w:lvlJc w:val="left"/>
+      <w:pPr>
+        <w:tabs>
+          <w:tab w:val="num" w:pos="3600"/>
+        </w:tabs>
+        <w:ind w:left="3600" w:hanging="360"/>
+      </w:pPr>
+      <w:rPr>
+        <w:rFonts w:ascii="Wingdings" w:hAnsi="Wingdings" w:hint="default"/>
+        <w:sz w:val="20"/>
+      </w:rPr>
+    </w:lvl>
+    <w:lvl w:ilvl="5" w:tentative="1">
+      <w:start w:val="1"/>
+      <w:numFmt w:val="bullet"/>
+      <w:lvlText w:val=""/>
+      <w:lvlJc w:val="left"/>
+      <w:pPr>
+        <w:tabs>
+          <w:tab w:val="num" w:pos="4320"/>
+        </w:tabs>
+        <w:ind w:left="4320" w:hanging="360"/>
+      </w:pPr>
+      <w:rPr>
+        <w:rFonts w:ascii="Wingdings" w:hAnsi="Wingdings" w:hint="default"/>
+        <w:sz w:val="20"/>
+      </w:rPr>
+    </w:lvl>
+    <w:lvl w:ilvl="6" w:tentative="1">
+      <w:start w:val="1"/>
+      <w:numFmt w:val="bullet"/>
+      <w:lvlText w:val=""/>
+      <w:lvlJc w:val="left"/>
+      <w:pPr>
+        <w:tabs>
+          <w:tab w:val="num" w:pos="5040"/>
+        </w:tabs>
+        <w:ind w:left="5040" w:hanging="360"/>
+      </w:pPr>
+      <w:rPr>
+        <w:rFonts w:ascii="Wingdings" w:hAnsi="Wingdings" w:hint="default"/>
+        <w:sz w:val="20"/>
+      </w:rPr>
+    </w:lvl>
+    <w:lvl w:ilvl="7" w:tentative="1">
+      <w:start w:val="1"/>
+      <w:numFmt w:val="bullet"/>
+      <w:lvlText w:val=""/>
+      <w:lvlJc w:val="left"/>
+      <w:pPr>
+        <w:tabs>
+          <w:tab w:val="num" w:pos="5760"/>
+        </w:tabs>
+        <w:ind w:left="5760" w:hanging="360"/>
+      </w:pPr>
+      <w:rPr>
+        <w:rFonts w:ascii="Wingdings" w:hAnsi="Wingdings" w:hint="default"/>
+        <w:sz w:val="20"/>
+      </w:rPr>
+    </w:lvl>
+    <w:lvl w:ilvl="8" w:tentative="1">
+      <w:start w:val="1"/>
+      <w:numFmt w:val="bullet"/>
+      <w:lvlText w:val=""/>
+      <w:lvlJc w:val="left"/>
+      <w:pPr>
+        <w:tabs>
+          <w:tab w:val="num" w:pos="6480"/>
+        </w:tabs>
+        <w:ind w:left="6480" w:hanging="360"/>
+      </w:pPr>
+      <w:rPr>
+        <w:rFonts w:ascii="Wingdings" w:hAnsi="Wingdings" w:hint="default"/>
+        <w:sz w:val="20"/>
+      </w:rPr>
+    </w:lvl>
+  </w:abstractNum>
+  <w:abstractNum w:abstractNumId="2" w15:restartNumberingAfterBreak="0">
+    <w:nsid w:val="6A283BB5"/>
+    <w:multiLevelType w:val="multilevel"/>
+    <w:tmpl w:val="BCF47EB8"/>
+    <w:lvl w:ilvl="0">
+      <w:start w:val="1"/>
+      <w:numFmt w:val="decimal"/>
+      <w:lvlText w:val="%1."/>
+      <w:lvlJc w:val="left"/>
+      <w:pPr>
+        <w:tabs>
+          <w:tab w:val="num" w:pos="720"/>
+        </w:tabs>
+        <w:ind w:left="720" w:hanging="360"/>
+      </w:pPr>
+    </w:lvl>
+    <w:lvl w:ilvl="1" w:tentative="1">
+      <w:start w:val="1"/>
+      <w:numFmt w:val="decimal"/>
+      <w:lvlText w:val="%2."/>
+      <w:lvlJc w:val="left"/>
+      <w:pPr>
+        <w:tabs>
+          <w:tab w:val="num" w:pos="1440"/>
+        </w:tabs>
+        <w:ind w:left="1440" w:hanging="360"/>
+      </w:pPr>
+    </w:lvl>
+    <w:lvl w:ilvl="2" w:tentative="1">
+      <w:start w:val="1"/>
+      <w:numFmt w:val="decimal"/>
+      <w:lvlText w:val="%3."/>
+      <w:lvlJc w:val="left"/>
+      <w:pPr>
+        <w:tabs>
+          <w:tab w:val="num" w:pos="2160"/>
+        </w:tabs>
+        <w:ind w:left="2160" w:hanging="360"/>
+      </w:pPr>
+    </w:lvl>
+    <w:lvl w:ilvl="3" w:tentative="1">
+      <w:start w:val="1"/>
+      <w:numFmt w:val="decimal"/>
+      <w:lvlText w:val="%4."/>
+      <w:lvlJc w:val="left"/>
+      <w:pPr>
+        <w:tabs>
+          <w:tab w:val="num" w:pos="2880"/>
+        </w:tabs>
+        <w:ind w:left="2880" w:hanging="360"/>
+      </w:pPr>
+    </w:lvl>
+    <w:lvl w:ilvl="4" w:tentative="1">
+      <w:start w:val="1"/>
+      <w:numFmt w:val="decimal"/>
+      <w:lvlText w:val="%5."/>
+      <w:lvlJc w:val="left"/>
+      <w:pPr>
+        <w:tabs>
+          <w:tab w:val="num" w:pos="3600"/>
+        </w:tabs>
+        <w:ind w:left="3600" w:hanging="360"/>
+      </w:pPr>
+    </w:lvl>
+    <w:lvl w:ilvl="5" w:tentative="1">
+      <w:start w:val="1"/>
+      <w:numFmt w:val="decimal"/>
+      <w:lvlText w:val="%6."/>
+      <w:lvlJc w:val="left"/>
+      <w:pPr>
+        <w:tabs>
+          <w:tab w:val="num" w:pos="4320"/>
+        </w:tabs>
+        <w:ind w:left="4320" w:hanging="360"/>
+      </w:pPr>
+    </w:lvl>
+    <w:lvl w:ilvl="6" w:tentative="1">
+      <w:start w:val="1"/>
+      <w:numFmt w:val="decimal"/>
+      <w:lvlText w:val="%7."/>
+      <w:lvlJc w:val="left"/>
+      <w:pPr>
+        <w:tabs>
+          <w:tab w:val="num" w:pos="5040"/>
+        </w:tabs>
+        <w:ind w:left="5040" w:hanging="360"/>
+      </w:pPr>
+    </w:lvl>
+    <w:lvl w:ilvl="7" w:tentative="1">
+      <w:start w:val="1"/>
+      <w:numFmt w:val="decimal"/>
+      <w:lvlText w:val="%8."/>
+      <w:lvlJc w:val="left"/>
+      <w:pPr>
+        <w:tabs>
+          <w:tab w:val="num" w:pos="5760"/>
+        </w:tabs>
+        <w:ind w:left="5760" w:hanging="360"/>
+      </w:pPr>
+    </w:lvl>
+    <w:lvl w:ilvl="8" w:tentative="1">
+      <w:start w:val="1"/>
+      <w:numFmt w:val="decimal"/>
+      <w:lvlText w:val="%9."/>
+      <w:lvlJc w:val="left"/>
+      <w:pPr>
+        <w:tabs>
+          <w:tab w:val="num" w:pos="6480"/>
+        </w:tabs>
+        <w:ind w:left="6480" w:hanging="360"/>
+      </w:pPr>
+    </w:lvl>
+  </w:abstractNum>
+  <w:num w:numId="1" w16cid:durableId="351226086">
+    <w:abstractNumId w:val="0"/>
+  </w:num>
+  <w:num w:numId="2" w16cid:durableId="917786938">
+    <w:abstractNumId w:val="1"/>
+  </w:num>
+  <w:num w:numId="3" w16cid:durableId="1995789882">
+    <w:abstractNumId w:val="2"/>
+  </w:num>
+</w:numbering>
+</file>
+
 <file path=word/styles.xml><?xml version="1.0" encoding="utf-8"?>
-<w:styles xmlns:mc="http://schemas.openxmlformats.org/markup-compatibility/2006" xmlns:r="http://schemas.openxmlformats.org/officeDocument/2006/relationships" xmlns:w="http://schemas.openxmlformats.org/wordprocessingml/2006/main" xmlns:w14="http://schemas.microsoft.com/office/word/2010/wordml" xmlns:w15="http://schemas.microsoft.com/office/word/2012/wordml" xmlns:w16cex="http://schemas.microsoft.com/office/word/2018/wordml/cex" xmlns:w16cid="http://schemas.microsoft.com/office/word/2016/wordml/cid" xmlns:w16="http://schemas.microsoft.com/office/word/2018/wordml" xmlns:w16du="http://schemas.microsoft.com/office/word/2023/wordml/word16du" xmlns:w16sdtdh="http://schemas.microsoft.com/office/word/2020/wordml/sdtdatahash" xmlns:w16se="http://schemas.microsoft.com/office/word/2015/wordml/symex" mc:Ignorable="w14 w15 w16se w16cid w16 w16cex w16sdtdh w16du">
+<w:styles xmlns:mc="http://schemas.openxmlformats.org/markup-compatibility/2006" xmlns:r="http://schemas.openxmlformats.org/officeDocument/2006/relationships" xmlns:w="http://schemas.openxmlformats.org/wordprocessingml/2006/main" xmlns:w14="http://schemas.microsoft.com/office/word/2010/wordml" xmlns:w15="http://schemas.microsoft.com/office/word/2012/wordml" xmlns:w16cex="http://schemas.microsoft.com/office/word/2018/wordml/cex" xmlns:w16cid="http://schemas.microsoft.com/office/word/2016/wordml/cid" xmlns:w16="http://schemas.microsoft.com/office/word/2018/wordml" xmlns:w16du="http://schemas.microsoft.com/office/word/2023/wordml/word16du" xmlns:w16sdtdh="http://schemas.microsoft.com/office/word/2020/wordml/sdtdatahash" xmlns:w16sdtfl="http://schemas.microsoft.com/office/word/2024/wordml/sdtformatlock" xmlns:w16se="http://schemas.microsoft.com/office/word/2015/wordml/symex" mc:Ignorable="w14 w15 w16se w16cid w16 w16cex w16sdtdh w16sdtfl w16du">
   <w:docDefaults>
     <w:rPrDefault>
       <w:rPr>

</xml_diff>